<commit_message>
Fix analysis readiness checklist, add timesheet/marketing intake and new leak engines, workspace scoping, exports, full Playwright e2e
</commit_message>
<xml_diff>
--- a/mock-business/northstar/northstar_business_notes.docx
+++ b/mock-business/northstar/northstar_business_notes.docx
@@ -17,7 +17,7 @@
     </w:p>
     <w:p>
       <w:r>
-        <w:t>Team: 6 field techs and 1 office manager. 3 service vans. Busy season is heating (Oct-Feb).</w:t>
+        <w:t>Team: 5 field techs and 1 office manager (Lisa). 3 service vans. Busy season is heating (Oct-Feb).</w:t>
       </w:r>
     </w:p>
     <w:p>
@@ -33,6 +33,16 @@
     <w:p>
       <w:r>
         <w:t>Jake and Marcus are working a lot of overtime because we have not hired a third senior tech yet.</w:t>
+      </w:r>
+    </w:p>
+    <w:p>
+      <w:r>
+        <w:t>We pay for Google Ads, Facebook Ads and Angi leads; I have never checked which ones actually bring in profitable jobs.</w:t>
+      </w:r>
+    </w:p>
+    <w:p>
+      <w:r>
+        <w:t>We had a couple of callbacks this summer (J-3121, J-3126) that we went back to for free.</w:t>
       </w:r>
     </w:p>
     <w:p>

</xml_diff>